<commit_message>
???????????????? ?????? Docker: ?????????? ???????? ?? ?????????????? ??????????
README: ???????????????? ?????????????????????????????? ?? ???????????? ???????????? ?????????? (C:\, D:\ ???), ??
???? ???????????? ?? C:\; ???????????????? ?????????????? ???????????????? ?????????????????????? ?????????????????? ??
???????????? ?????????? ?????? ???? ???????????? ???????? ???????????? ?? ??????????????. ???? ???? ??? ?? ????????????
??????
???????????????? ???????????? ?? ?? ?????????????????? ????????????????????.
</commit_message>
<xml_diff>
--- a/docs/Инструкция.docx
+++ b/docs/Инструкция.docx
@@ -109,7 +109,7 @@
     <w:sdt>
       <w:sdtPr>
         <w:alias w:val="Содержание"/>
-        <w:id w:val="-104577558"/>
+        <w:id w:val="-2020534454"/>
       </w:sdtPr>
       <w:sdtEndPr/>
       <w:sdtContent>
@@ -137,7 +137,7 @@
           <w:r>
             <w:fldChar w:fldCharType="separate"/>
           </w:r>
-          <w:hyperlink w:anchor="_Toc242996024" w:history="1">
+          <w:hyperlink w:anchor="_Toc243000775" w:history="1">
             <w:r>
               <w:rPr>
                 <w:rStyle w:val="Hyperlink"/>
@@ -161,7 +161,7 @@
               <w:rPr>
                 <w:noProof/>
               </w:rPr>
-              <w:instrText xml:space="preserve"> PAGEREF _Toc242996024 \h </w:instrText>
+              <w:instrText xml:space="preserve"> PAGEREF _Toc243000775 \h </w:instrText>
             </w:r>
             <w:r>
               <w:rPr>
@@ -203,7 +203,7 @@
               <w14:ligatures w14:val="standardContextual"/>
             </w:rPr>
           </w:pPr>
-          <w:hyperlink w:anchor="_Toc242996025" w:history="1">
+          <w:hyperlink w:anchor="_Toc243000776" w:history="1">
             <w:r>
               <w:rPr>
                 <w:rStyle w:val="Hyperlink"/>
@@ -227,7 +227,7 @@
               <w:rPr>
                 <w:noProof/>
               </w:rPr>
-              <w:instrText xml:space="preserve"> PAGEREF _Toc242996025 \h </w:instrText>
+              <w:instrText xml:space="preserve"> PAGEREF _Toc243000776 \h </w:instrText>
             </w:r>
             <w:r>
               <w:rPr>
@@ -269,7 +269,7 @@
               <w14:ligatures w14:val="standardContextual"/>
             </w:rPr>
           </w:pPr>
-          <w:hyperlink w:anchor="_Toc242996026" w:history="1">
+          <w:hyperlink w:anchor="_Toc243000777" w:history="1">
             <w:r>
               <w:rPr>
                 <w:rStyle w:val="Hyperlink"/>
@@ -293,7 +293,7 @@
               <w:rPr>
                 <w:noProof/>
               </w:rPr>
-              <w:instrText xml:space="preserve"> PAGEREF _Toc242996026 \h </w:instrText>
+              <w:instrText xml:space="preserve"> PAGEREF _Toc243000777 \h </w:instrText>
             </w:r>
             <w:r>
               <w:rPr>
@@ -335,7 +335,7 @@
               <w14:ligatures w14:val="standardContextual"/>
             </w:rPr>
           </w:pPr>
-          <w:hyperlink w:anchor="_Toc242996027" w:history="1">
+          <w:hyperlink w:anchor="_Toc243000778" w:history="1">
             <w:r>
               <w:rPr>
                 <w:rStyle w:val="Hyperlink"/>
@@ -359,7 +359,7 @@
               <w:rPr>
                 <w:noProof/>
               </w:rPr>
-              <w:instrText xml:space="preserve"> PAGEREF _Toc242996027 \h </w:instrText>
+              <w:instrText xml:space="preserve"> PAGEREF _Toc243000778 \h </w:instrText>
             </w:r>
             <w:r>
               <w:rPr>
@@ -401,7 +401,7 @@
               <w14:ligatures w14:val="standardContextual"/>
             </w:rPr>
           </w:pPr>
-          <w:hyperlink w:anchor="_Toc242996028" w:history="1">
+          <w:hyperlink w:anchor="_Toc243000779" w:history="1">
             <w:r>
               <w:rPr>
                 <w:rStyle w:val="Hyperlink"/>
@@ -425,7 +425,7 @@
               <w:rPr>
                 <w:noProof/>
               </w:rPr>
-              <w:instrText xml:space="preserve"> PAGEREF _Toc242996028 \h </w:instrText>
+              <w:instrText xml:space="preserve"> PAGEREF _Toc243000779 \h </w:instrText>
             </w:r>
             <w:r>
               <w:rPr>
@@ -467,7 +467,7 @@
               <w14:ligatures w14:val="standardContextual"/>
             </w:rPr>
           </w:pPr>
-          <w:hyperlink w:anchor="_Toc242996029" w:history="1">
+          <w:hyperlink w:anchor="_Toc243000780" w:history="1">
             <w:r>
               <w:rPr>
                 <w:rStyle w:val="Hyperlink"/>
@@ -491,7 +491,7 @@
               <w:rPr>
                 <w:noProof/>
               </w:rPr>
-              <w:instrText xml:space="preserve"> PAGEREF _Toc242996029 \h </w:instrText>
+              <w:instrText xml:space="preserve"> PAGEREF _Toc243000780 \h </w:instrText>
             </w:r>
             <w:r>
               <w:rPr>
@@ -533,7 +533,7 @@
               <w14:ligatures w14:val="standardContextual"/>
             </w:rPr>
           </w:pPr>
-          <w:hyperlink w:anchor="_Toc242996030" w:history="1">
+          <w:hyperlink w:anchor="_Toc243000781" w:history="1">
             <w:r>
               <w:rPr>
                 <w:rStyle w:val="Hyperlink"/>
@@ -557,7 +557,7 @@
               <w:rPr>
                 <w:noProof/>
               </w:rPr>
-              <w:instrText xml:space="preserve"> PAGEREF _Toc242996030 \h </w:instrText>
+              <w:instrText xml:space="preserve"> PAGEREF _Toc243000781 \h </w:instrText>
             </w:r>
             <w:r>
               <w:rPr>
@@ -599,7 +599,7 @@
               <w14:ligatures w14:val="standardContextual"/>
             </w:rPr>
           </w:pPr>
-          <w:hyperlink w:anchor="_Toc242996031" w:history="1">
+          <w:hyperlink w:anchor="_Toc243000782" w:history="1">
             <w:r>
               <w:rPr>
                 <w:rStyle w:val="Hyperlink"/>
@@ -623,7 +623,7 @@
               <w:rPr>
                 <w:noProof/>
               </w:rPr>
-              <w:instrText xml:space="preserve"> PAGEREF _Toc242996031 \h </w:instrText>
+              <w:instrText xml:space="preserve"> PAGEREF _Toc243000782 \h </w:instrText>
             </w:r>
             <w:r>
               <w:rPr>
@@ -665,7 +665,7 @@
               <w14:ligatures w14:val="standardContextual"/>
             </w:rPr>
           </w:pPr>
-          <w:hyperlink w:anchor="_Toc242996032" w:history="1">
+          <w:hyperlink w:anchor="_Toc243000783" w:history="1">
             <w:r>
               <w:rPr>
                 <w:rStyle w:val="Hyperlink"/>
@@ -689,7 +689,7 @@
               <w:rPr>
                 <w:noProof/>
               </w:rPr>
-              <w:instrText xml:space="preserve"> PAGEREF _Toc242996032 \h </w:instrText>
+              <w:instrText xml:space="preserve"> PAGEREF _Toc243000783 \h </w:instrText>
             </w:r>
             <w:r>
               <w:rPr>
@@ -731,7 +731,7 @@
               <w14:ligatures w14:val="standardContextual"/>
             </w:rPr>
           </w:pPr>
-          <w:hyperlink w:anchor="_Toc242996033" w:history="1">
+          <w:hyperlink w:anchor="_Toc243000784" w:history="1">
             <w:r>
               <w:rPr>
                 <w:rStyle w:val="Hyperlink"/>
@@ -755,7 +755,7 @@
               <w:rPr>
                 <w:noProof/>
               </w:rPr>
-              <w:instrText xml:space="preserve"> PAGEREF _Toc242996033 \h </w:instrText>
+              <w:instrText xml:space="preserve"> PAGEREF _Toc243000784 \h </w:instrText>
             </w:r>
             <w:r>
               <w:rPr>
@@ -797,7 +797,7 @@
               <w14:ligatures w14:val="standardContextual"/>
             </w:rPr>
           </w:pPr>
-          <w:hyperlink w:anchor="_Toc242996034" w:history="1">
+          <w:hyperlink w:anchor="_Toc243000785" w:history="1">
             <w:r>
               <w:rPr>
                 <w:rStyle w:val="Hyperlink"/>
@@ -821,7 +821,7 @@
               <w:rPr>
                 <w:noProof/>
               </w:rPr>
-              <w:instrText xml:space="preserve"> PAGEREF _Toc242996034 \h </w:instrText>
+              <w:instrText xml:space="preserve"> PAGEREF _Toc243000785 \h </w:instrText>
             </w:r>
             <w:r>
               <w:rPr>
@@ -863,7 +863,7 @@
               <w14:ligatures w14:val="standardContextual"/>
             </w:rPr>
           </w:pPr>
-          <w:hyperlink w:anchor="_Toc242996035" w:history="1">
+          <w:hyperlink w:anchor="_Toc243000786" w:history="1">
             <w:r>
               <w:rPr>
                 <w:rStyle w:val="Hyperlink"/>
@@ -887,7 +887,7 @@
               <w:rPr>
                 <w:noProof/>
               </w:rPr>
-              <w:instrText xml:space="preserve"> PAGEREF _Toc242996035 \h </w:instrText>
+              <w:instrText xml:space="preserve"> PAGEREF _Toc243000786 \h </w:instrText>
             </w:r>
             <w:r>
               <w:rPr>
@@ -929,7 +929,7 @@
               <w14:ligatures w14:val="standardContextual"/>
             </w:rPr>
           </w:pPr>
-          <w:hyperlink w:anchor="_Toc242996036" w:history="1">
+          <w:hyperlink w:anchor="_Toc243000787" w:history="1">
             <w:r>
               <w:rPr>
                 <w:rStyle w:val="Hyperlink"/>
@@ -953,7 +953,7 @@
               <w:rPr>
                 <w:noProof/>
               </w:rPr>
-              <w:instrText xml:space="preserve"> PAGEREF _Toc242996036 \h </w:instrText>
+              <w:instrText xml:space="preserve"> PAGEREF _Toc243000787 \h </w:instrText>
             </w:r>
             <w:r>
               <w:rPr>
@@ -995,7 +995,7 @@
               <w14:ligatures w14:val="standardContextual"/>
             </w:rPr>
           </w:pPr>
-          <w:hyperlink w:anchor="_Toc242996037" w:history="1">
+          <w:hyperlink w:anchor="_Toc243000788" w:history="1">
             <w:r>
               <w:rPr>
                 <w:rStyle w:val="Hyperlink"/>
@@ -1019,7 +1019,7 @@
               <w:rPr>
                 <w:noProof/>
               </w:rPr>
-              <w:instrText xml:space="preserve"> PAGEREF _Toc242996037 \h </w:instrText>
+              <w:instrText xml:space="preserve"> PAGEREF _Toc243000788 \h </w:instrText>
             </w:r>
             <w:r>
               <w:rPr>
@@ -1061,7 +1061,7 @@
               <w14:ligatures w14:val="standardContextual"/>
             </w:rPr>
           </w:pPr>
-          <w:hyperlink w:anchor="_Toc242996038" w:history="1">
+          <w:hyperlink w:anchor="_Toc243000789" w:history="1">
             <w:r>
               <w:rPr>
                 <w:rStyle w:val="Hyperlink"/>
@@ -1085,7 +1085,7 @@
               <w:rPr>
                 <w:noProof/>
               </w:rPr>
-              <w:instrText xml:space="preserve"> PAGEREF _Toc242996038 \h </w:instrText>
+              <w:instrText xml:space="preserve"> PAGEREF _Toc243000789 \h </w:instrText>
             </w:r>
             <w:r>
               <w:rPr>
@@ -1127,7 +1127,7 @@
               <w14:ligatures w14:val="standardContextual"/>
             </w:rPr>
           </w:pPr>
-          <w:hyperlink w:anchor="_Toc242996039" w:history="1">
+          <w:hyperlink w:anchor="_Toc243000790" w:history="1">
             <w:r>
               <w:rPr>
                 <w:rStyle w:val="Hyperlink"/>
@@ -1151,7 +1151,7 @@
               <w:rPr>
                 <w:noProof/>
               </w:rPr>
-              <w:instrText xml:space="preserve"> PAGEREF _Toc242996039 \h </w:instrText>
+              <w:instrText xml:space="preserve"> PAGEREF _Toc243000790 \h </w:instrText>
             </w:r>
             <w:r>
               <w:rPr>
@@ -1193,7 +1193,7 @@
               <w14:ligatures w14:val="standardContextual"/>
             </w:rPr>
           </w:pPr>
-          <w:hyperlink w:anchor="_Toc242996040" w:history="1">
+          <w:hyperlink w:anchor="_Toc243000791" w:history="1">
             <w:r>
               <w:rPr>
                 <w:rStyle w:val="Hyperlink"/>
@@ -1217,7 +1217,7 @@
               <w:rPr>
                 <w:noProof/>
               </w:rPr>
-              <w:instrText xml:space="preserve"> PAGEREF _Toc242996040 \h </w:instrText>
+              <w:instrText xml:space="preserve"> PAGEREF _Toc243000791 \h </w:instrText>
             </w:r>
             <w:r>
               <w:rPr>
@@ -1259,7 +1259,7 @@
               <w14:ligatures w14:val="standardContextual"/>
             </w:rPr>
           </w:pPr>
-          <w:hyperlink w:anchor="_Toc242996041" w:history="1">
+          <w:hyperlink w:anchor="_Toc243000792" w:history="1">
             <w:r>
               <w:rPr>
                 <w:rStyle w:val="Hyperlink"/>
@@ -1283,7 +1283,7 @@
               <w:rPr>
                 <w:noProof/>
               </w:rPr>
-              <w:instrText xml:space="preserve"> PAGEREF _Toc242996041 \h </w:instrText>
+              <w:instrText xml:space="preserve"> PAGEREF _Toc243000792 \h </w:instrText>
             </w:r>
             <w:r>
               <w:rPr>
@@ -1325,7 +1325,7 @@
               <w14:ligatures w14:val="standardContextual"/>
             </w:rPr>
           </w:pPr>
-          <w:hyperlink w:anchor="_Toc242996042" w:history="1">
+          <w:hyperlink w:anchor="_Toc243000793" w:history="1">
             <w:r>
               <w:rPr>
                 <w:rStyle w:val="Hyperlink"/>
@@ -1349,7 +1349,7 @@
               <w:rPr>
                 <w:noProof/>
               </w:rPr>
-              <w:instrText xml:space="preserve"> PAGEREF _Toc242996042 \h </w:instrText>
+              <w:instrText xml:space="preserve"> PAGEREF _Toc243000793 \h </w:instrText>
             </w:r>
             <w:r>
               <w:rPr>
@@ -1391,7 +1391,7 @@
               <w14:ligatures w14:val="standardContextual"/>
             </w:rPr>
           </w:pPr>
-          <w:hyperlink w:anchor="_Toc242996043" w:history="1">
+          <w:hyperlink w:anchor="_Toc243000794" w:history="1">
             <w:r>
               <w:rPr>
                 <w:rStyle w:val="Hyperlink"/>
@@ -1415,7 +1415,7 @@
               <w:rPr>
                 <w:noProof/>
               </w:rPr>
-              <w:instrText xml:space="preserve"> PAGEREF _Toc242996043 \h </w:instrText>
+              <w:instrText xml:space="preserve"> PAGEREF _Toc243000794 \h </w:instrText>
             </w:r>
             <w:r>
               <w:rPr>
@@ -1457,7 +1457,7 @@
               <w14:ligatures w14:val="standardContextual"/>
             </w:rPr>
           </w:pPr>
-          <w:hyperlink w:anchor="_Toc242996044" w:history="1">
+          <w:hyperlink w:anchor="_Toc243000795" w:history="1">
             <w:r>
               <w:rPr>
                 <w:rStyle w:val="Hyperlink"/>
@@ -1481,7 +1481,7 @@
               <w:rPr>
                 <w:noProof/>
               </w:rPr>
-              <w:instrText xml:space="preserve"> PAGEREF _Toc242996044 \h </w:instrText>
+              <w:instrText xml:space="preserve"> PAGEREF _Toc243000795 \h </w:instrText>
             </w:r>
             <w:r>
               <w:rPr>
@@ -1523,7 +1523,7 @@
               <w14:ligatures w14:val="standardContextual"/>
             </w:rPr>
           </w:pPr>
-          <w:hyperlink w:anchor="_Toc242996045" w:history="1">
+          <w:hyperlink w:anchor="_Toc243000796" w:history="1">
             <w:r>
               <w:rPr>
                 <w:rStyle w:val="Hyperlink"/>
@@ -1547,7 +1547,7 @@
               <w:rPr>
                 <w:noProof/>
               </w:rPr>
-              <w:instrText xml:space="preserve"> PAGEREF _Toc242996045 \h </w:instrText>
+              <w:instrText xml:space="preserve"> PAGEREF _Toc243000796 \h </w:instrText>
             </w:r>
             <w:r>
               <w:rPr>
@@ -1589,7 +1589,7 @@
               <w14:ligatures w14:val="standardContextual"/>
             </w:rPr>
           </w:pPr>
-          <w:hyperlink w:anchor="_Toc242996046" w:history="1">
+          <w:hyperlink w:anchor="_Toc243000797" w:history="1">
             <w:r>
               <w:rPr>
                 <w:rStyle w:val="Hyperlink"/>
@@ -1613,7 +1613,7 @@
               <w:rPr>
                 <w:noProof/>
               </w:rPr>
-              <w:instrText xml:space="preserve"> PAGEREF _Toc242996046 \h </w:instrText>
+              <w:instrText xml:space="preserve"> PAGEREF _Toc243000797 \h </w:instrText>
             </w:r>
             <w:r>
               <w:rPr>
@@ -1655,7 +1655,7 @@
               <w14:ligatures w14:val="standardContextual"/>
             </w:rPr>
           </w:pPr>
-          <w:hyperlink w:anchor="_Toc242996047" w:history="1">
+          <w:hyperlink w:anchor="_Toc243000798" w:history="1">
             <w:r>
               <w:rPr>
                 <w:rStyle w:val="Hyperlink"/>
@@ -1679,7 +1679,7 @@
               <w:rPr>
                 <w:noProof/>
               </w:rPr>
-              <w:instrText xml:space="preserve"> PAGEREF _Toc242996047 \h </w:instrText>
+              <w:instrText xml:space="preserve"> PAGEREF _Toc243000798 \h </w:instrText>
             </w:r>
             <w:r>
               <w:rPr>
@@ -1721,7 +1721,7 @@
               <w14:ligatures w14:val="standardContextual"/>
             </w:rPr>
           </w:pPr>
-          <w:hyperlink w:anchor="_Toc242996048" w:history="1">
+          <w:hyperlink w:anchor="_Toc243000799" w:history="1">
             <w:r>
               <w:rPr>
                 <w:rStyle w:val="Hyperlink"/>
@@ -1745,7 +1745,7 @@
               <w:rPr>
                 <w:noProof/>
               </w:rPr>
-              <w:instrText xml:space="preserve"> PAGEREF _Toc242996048 \h </w:instrText>
+              <w:instrText xml:space="preserve"> PAGEREF _Toc243000799 \h </w:instrText>
             </w:r>
             <w:r>
               <w:rPr>
@@ -1787,7 +1787,7 @@
               <w14:ligatures w14:val="standardContextual"/>
             </w:rPr>
           </w:pPr>
-          <w:hyperlink w:anchor="_Toc242996049" w:history="1">
+          <w:hyperlink w:anchor="_Toc243000800" w:history="1">
             <w:r>
               <w:rPr>
                 <w:rStyle w:val="Hyperlink"/>
@@ -1811,7 +1811,7 @@
               <w:rPr>
                 <w:noProof/>
               </w:rPr>
-              <w:instrText xml:space="preserve"> PAGEREF _Toc242996049 \h </w:instrText>
+              <w:instrText xml:space="preserve"> PAGEREF _Toc243000800 \h </w:instrText>
             </w:r>
             <w:r>
               <w:rPr>
@@ -1853,7 +1853,7 @@
               <w14:ligatures w14:val="standardContextual"/>
             </w:rPr>
           </w:pPr>
-          <w:hyperlink w:anchor="_Toc242996050" w:history="1">
+          <w:hyperlink w:anchor="_Toc243000801" w:history="1">
             <w:r>
               <w:rPr>
                 <w:rStyle w:val="Hyperlink"/>
@@ -1877,7 +1877,7 @@
               <w:rPr>
                 <w:noProof/>
               </w:rPr>
-              <w:instrText xml:space="preserve"> PAGEREF _Toc242996050 \h </w:instrText>
+              <w:instrText xml:space="preserve"> PAGEREF _Toc243000801 \h </w:instrText>
             </w:r>
             <w:r>
               <w:rPr>
@@ -1919,7 +1919,7 @@
               <w14:ligatures w14:val="standardContextual"/>
             </w:rPr>
           </w:pPr>
-          <w:hyperlink w:anchor="_Toc242996051" w:history="1">
+          <w:hyperlink w:anchor="_Toc243000802" w:history="1">
             <w:r>
               <w:rPr>
                 <w:rStyle w:val="Hyperlink"/>
@@ -1943,7 +1943,7 @@
               <w:rPr>
                 <w:noProof/>
               </w:rPr>
-              <w:instrText xml:space="preserve"> PAGEREF _Toc242996051 \h </w:instrText>
+              <w:instrText xml:space="preserve"> PAGEREF _Toc243000802 \h </w:instrText>
             </w:r>
             <w:r>
               <w:rPr>
@@ -1985,7 +1985,7 @@
               <w14:ligatures w14:val="standardContextual"/>
             </w:rPr>
           </w:pPr>
-          <w:hyperlink w:anchor="_Toc242996052" w:history="1">
+          <w:hyperlink w:anchor="_Toc243000803" w:history="1">
             <w:r>
               <w:rPr>
                 <w:rStyle w:val="Hyperlink"/>
@@ -2009,7 +2009,7 @@
               <w:rPr>
                 <w:noProof/>
               </w:rPr>
-              <w:instrText xml:space="preserve"> PAGEREF _Toc242996052 \h </w:instrText>
+              <w:instrText xml:space="preserve"> PAGEREF _Toc243000803 \h </w:instrText>
             </w:r>
             <w:r>
               <w:rPr>
@@ -2051,7 +2051,7 @@
               <w14:ligatures w14:val="standardContextual"/>
             </w:rPr>
           </w:pPr>
-          <w:hyperlink w:anchor="_Toc242996053" w:history="1">
+          <w:hyperlink w:anchor="_Toc243000804" w:history="1">
             <w:r>
               <w:rPr>
                 <w:rStyle w:val="Hyperlink"/>
@@ -2075,7 +2075,7 @@
               <w:rPr>
                 <w:noProof/>
               </w:rPr>
-              <w:instrText xml:space="preserve"> PAGEREF _Toc242996053 \h </w:instrText>
+              <w:instrText xml:space="preserve"> PAGEREF _Toc243000804 \h </w:instrText>
             </w:r>
             <w:r>
               <w:rPr>
@@ -2117,7 +2117,7 @@
               <w14:ligatures w14:val="standardContextual"/>
             </w:rPr>
           </w:pPr>
-          <w:hyperlink w:anchor="_Toc242996054" w:history="1">
+          <w:hyperlink w:anchor="_Toc243000805" w:history="1">
             <w:r>
               <w:rPr>
                 <w:rStyle w:val="Hyperlink"/>
@@ -2141,7 +2141,7 @@
               <w:rPr>
                 <w:noProof/>
               </w:rPr>
-              <w:instrText xml:space="preserve"> PAGEREF _Toc242996054 \h </w:instrText>
+              <w:instrText xml:space="preserve"> PAGEREF _Toc243000805 \h </w:instrText>
             </w:r>
             <w:r>
               <w:rPr>
@@ -2183,7 +2183,7 @@
               <w14:ligatures w14:val="standardContextual"/>
             </w:rPr>
           </w:pPr>
-          <w:hyperlink w:anchor="_Toc242996055" w:history="1">
+          <w:hyperlink w:anchor="_Toc243000806" w:history="1">
             <w:r>
               <w:rPr>
                 <w:rStyle w:val="Hyperlink"/>
@@ -2207,7 +2207,7 @@
               <w:rPr>
                 <w:noProof/>
               </w:rPr>
-              <w:instrText xml:space="preserve"> PAGEREF _Toc242996055 \h </w:instrText>
+              <w:instrText xml:space="preserve"> PAGEREF _Toc243000806 \h </w:instrText>
             </w:r>
             <w:r>
               <w:rPr>
@@ -2251,7 +2251,7 @@
         <w:pStyle w:val="Heading1"/>
         <w:spacing w:before="480" w:after="200"/>
       </w:pPr>
-      <w:bookmarkStart w:id="0" w:name="_Toc242996024"/>
+      <w:bookmarkStart w:id="0" w:name="_Toc243000775"/>
       <w:r>
         <w:t>1. Как это устроено</w:t>
       </w:r>
@@ -2793,7 +2793,7 @@
         <w:pStyle w:val="Heading1"/>
         <w:spacing w:before="480" w:after="200"/>
       </w:pPr>
-      <w:bookmarkStart w:id="1" w:name="_Toc242996025"/>
+      <w:bookmarkStart w:id="1" w:name="_Toc243000776"/>
       <w:r>
         <w:t>2. Что понадобится</w:t>
       </w:r>
@@ -3199,7 +3199,7 @@
         <w:pStyle w:val="Heading1"/>
         <w:spacing w:before="480" w:after="200"/>
       </w:pPr>
-      <w:bookmarkStart w:id="2" w:name="_Toc242996026"/>
+      <w:bookmarkStart w:id="2" w:name="_Toc243000777"/>
       <w:r>
         <w:t>3. Установка Docker Desktop</w:t>
       </w:r>
@@ -3787,7 +3787,7 @@
         <w:pStyle w:val="Heading1"/>
         <w:spacing w:before="480" w:after="200"/>
       </w:pPr>
-      <w:bookmarkStart w:id="3" w:name="_Toc242996027"/>
+      <w:bookmarkStart w:id="3" w:name="_Toc243000778"/>
       <w:r>
         <w:t>4. Получение проекта</w:t>
       </w:r>
@@ -3810,7 +3810,31 @@
         <w:t>C:\historian2grafana</w:t>
       </w:r>
       <w:r>
-        <w:t>.</w:t>
+        <w:t xml:space="preserve"> или </w:t>
+      </w:r>
+      <w:r>
+        <w:rPr>
+          <w:rFonts w:ascii="Consolas" w:eastAsia="Consolas" w:hAnsi="Consolas" w:cs="Consolas"/>
+          <w:sz w:val="20"/>
+          <w:szCs w:val="20"/>
+          <w:shd w:val="clear" w:color="auto" w:fill="EEF1F5"/>
+        </w:rPr>
+        <w:t>D:\historian2grafana</w:t>
+      </w:r>
+      <w:r>
+        <w:t xml:space="preserve"> — диск может быть любой. Ниже в примерах — </w:t>
+      </w:r>
+      <w:r>
+        <w:rPr>
+          <w:rFonts w:ascii="Consolas" w:eastAsia="Consolas" w:hAnsi="Consolas" w:cs="Consolas"/>
+          <w:sz w:val="20"/>
+          <w:szCs w:val="20"/>
+          <w:shd w:val="clear" w:color="auto" w:fill="EEF1F5"/>
+        </w:rPr>
+        <w:t>C:\historian2grafana</w:t>
+      </w:r>
+      <w:r>
+        <w:t>; если у вас другой путь, подставляйте свой.</w:t>
       </w:r>
     </w:p>
     <w:p>
@@ -4019,7 +4043,7 @@
         <w:pStyle w:val="Heading1"/>
         <w:spacing w:before="480" w:after="200"/>
       </w:pPr>
-      <w:bookmarkStart w:id="4" w:name="_Toc242996028"/>
+      <w:bookmarkStart w:id="4" w:name="_Toc243000779"/>
       <w:r>
         <w:t>5. Настройка и запуск</w:t>
       </w:r>
@@ -4029,7 +4053,7 @@
       <w:pPr>
         <w:pStyle w:val="Heading2"/>
       </w:pPr>
-      <w:bookmarkStart w:id="5" w:name="_Toc242996029"/>
+      <w:bookmarkStart w:id="5" w:name="_Toc243000780"/>
       <w:r>
         <w:t>5.1 Файл .env — порты и пароли</w:t>
       </w:r>
@@ -4705,7 +4729,7 @@
       <w:pPr>
         <w:pStyle w:val="Heading2"/>
       </w:pPr>
-      <w:bookmarkStart w:id="6" w:name="_Toc242996030"/>
+      <w:bookmarkStart w:id="6" w:name="_Toc243000781"/>
       <w:r>
         <w:t>5.2 Запуск</w:t>
       </w:r>
@@ -4930,7 +4954,7 @@
         <w:pStyle w:val="Heading1"/>
         <w:spacing w:before="480" w:after="200"/>
       </w:pPr>
-      <w:bookmarkStart w:id="7" w:name="_Toc242996031"/>
+      <w:bookmarkStart w:id="7" w:name="_Toc243000782"/>
       <w:r>
         <w:t>6. Проверка сети до историка</w:t>
       </w:r>
@@ -5288,7 +5312,7 @@
         <w:pStyle w:val="Heading1"/>
         <w:spacing w:before="480" w:after="200"/>
       </w:pPr>
-      <w:bookmarkStart w:id="8" w:name="_Toc242996032"/>
+      <w:bookmarkStart w:id="8" w:name="_Toc243000783"/>
       <w:r>
         <w:t>7. Подключение к историку</w:t>
       </w:r>
@@ -5333,7 +5357,7 @@
           <w:noProof/>
         </w:rPr>
         <w:drawing>
-          <wp:inline distT="0" distB="0" distL="0" distR="0" wp14:anchorId="5EFE9352" wp14:editId="67668D66">
+          <wp:inline distT="0" distB="0" distL="0" distR="0" wp14:anchorId="126E0E5E" wp14:editId="2329F608">
             <wp:extent cx="5334000" cy="2952750"/>
             <wp:effectExtent l="0" t="0" r="0" b="0"/>
             <wp:docPr id="1" name="Страница «Подключение»" descr="Страница «Подключение»" title="Страница «Подключение»"/>
@@ -5392,7 +5416,7 @@
       <w:pPr>
         <w:pStyle w:val="Heading2"/>
       </w:pPr>
-      <w:bookmarkStart w:id="9" w:name="_Toc242996033"/>
+      <w:bookmarkStart w:id="9" w:name="_Toc243000784"/>
       <w:r>
         <w:t>7.1 Сервер</w:t>
       </w:r>
@@ -5684,7 +5708,7 @@
       <w:pPr>
         <w:pStyle w:val="Heading2"/>
       </w:pPr>
-      <w:bookmarkStart w:id="10" w:name="_Toc242996034"/>
+      <w:bookmarkStart w:id="10" w:name="_Toc243000785"/>
       <w:r>
         <w:t>7.2 Вход</w:t>
       </w:r>
@@ -5762,7 +5786,7 @@
           <w:noProof/>
         </w:rPr>
         <w:drawing>
-          <wp:inline distT="0" distB="0" distL="0" distR="0" wp14:anchorId="644B6F60" wp14:editId="3CFC903D">
+          <wp:inline distT="0" distB="0" distL="0" distR="0" wp14:anchorId="1BD04822" wp14:editId="206BEECF">
             <wp:extent cx="5334000" cy="2952750"/>
             <wp:effectExtent l="0" t="0" r="0" b="0"/>
             <wp:docPr id="2" name="Вход учётной записью Windows: логин вместе с доменом" descr="Вход учётной записью Windows: логин вместе с доменом" title="Вход учётной записью Windows: логин вместе с доменом"/>
@@ -5863,7 +5887,7 @@
       <w:pPr>
         <w:pStyle w:val="Heading2"/>
       </w:pPr>
-      <w:bookmarkStart w:id="11" w:name="_Toc242996035"/>
+      <w:bookmarkStart w:id="11" w:name="_Toc243000786"/>
       <w:r>
         <w:t>7.3 Что копировать</w:t>
       </w:r>
@@ -5880,7 +5904,7 @@
           <w:noProof/>
         </w:rPr>
         <w:drawing>
-          <wp:inline distT="0" distB="0" distL="0" distR="0" wp14:anchorId="4036503F" wp14:editId="7EB163CA">
+          <wp:inline distT="0" distB="0" distL="0" distR="0" wp14:anchorId="67B5465A" wp14:editId="3058CBA7">
             <wp:extent cx="5334000" cy="2952750"/>
             <wp:effectExtent l="0" t="0" r="0" b="0"/>
             <wp:docPr id="3" name="Выбор тегов и дополнительные настройки" descr="Выбор тегов и дополнительные настройки" title="Выбор тегов и дополнительные настройки"/>
@@ -6487,7 +6511,7 @@
       <w:pPr>
         <w:pStyle w:val="Heading2"/>
       </w:pPr>
-      <w:bookmarkStart w:id="12" w:name="_Toc242996036"/>
+      <w:bookmarkStart w:id="12" w:name="_Toc243000787"/>
       <w:r>
         <w:t>7.4 Дополнительно</w:t>
       </w:r>
@@ -6995,7 +7019,7 @@
       <w:pPr>
         <w:pStyle w:val="Heading2"/>
       </w:pPr>
-      <w:bookmarkStart w:id="13" w:name="_Toc242996037"/>
+      <w:bookmarkStart w:id="13" w:name="_Toc243000788"/>
       <w:r>
         <w:t>7.5 Проверка и запуск копирования</w:t>
       </w:r>
@@ -7091,7 +7115,7 @@
           <w:noProof/>
         </w:rPr>
         <w:drawing>
-          <wp:inline distT="0" distB="0" distL="0" distR="0" wp14:anchorId="764E3397" wp14:editId="311E27C2">
+          <wp:inline distT="0" distB="0" distL="0" distR="0" wp14:anchorId="5989A127" wp14:editId="0FF84D0E">
             <wp:extent cx="5334000" cy="2952750"/>
             <wp:effectExtent l="0" t="0" r="0" b="0"/>
             <wp:docPr id="4" name="Проверка прошла: подключение, теги и значения в порядке" descr="Проверка прошла: подключение, теги и значения в порядке" title="Проверка прошла: подключение, теги и значения в порядке"/>
@@ -7205,7 +7229,7 @@
         <w:pStyle w:val="Heading1"/>
         <w:spacing w:before="480" w:after="200"/>
       </w:pPr>
-      <w:bookmarkStart w:id="14" w:name="_Toc242996038"/>
+      <w:bookmarkStart w:id="14" w:name="_Toc243000789"/>
       <w:r>
         <w:t>8. Загрузка данных</w:t>
       </w:r>
@@ -7240,7 +7264,7 @@
           <w:noProof/>
         </w:rPr>
         <w:drawing>
-          <wp:inline distT="0" distB="0" distL="0" distR="0" wp14:anchorId="6CE819B6" wp14:editId="1F2F4BF6">
+          <wp:inline distT="0" distB="0" distL="0" distR="0" wp14:anchorId="43B0DD8A" wp14:editId="732FCD99">
             <wp:extent cx="5334000" cy="2952750"/>
             <wp:effectExtent l="0" t="0" r="0" b="0"/>
             <wp:docPr id="5" name="Страница «Загрузка»: копирование идёт" descr="Страница «Загрузка»: копирование идёт" title="Страница «Загрузка»: копирование идёт"/>
@@ -7824,7 +7848,7 @@
           <w:noProof/>
         </w:rPr>
         <w:drawing>
-          <wp:inline distT="0" distB="0" distL="0" distR="0" wp14:anchorId="7481E51F" wp14:editId="363FBE6A">
+          <wp:inline distT="0" distB="0" distL="0" distR="0" wp14:anchorId="0BEF57F4" wp14:editId="780DD85F">
             <wp:extent cx="5334000" cy="2952750"/>
             <wp:effectExtent l="0" t="0" r="0" b="0"/>
             <wp:docPr id="6" name="Таблица тегов на странице «Загрузка»" descr="Таблица тегов на странице «Загрузка»" title="Таблица тегов на странице «Загрузка»"/>
@@ -7953,7 +7977,7 @@
         <w:pStyle w:val="Heading1"/>
         <w:spacing w:before="480" w:after="200"/>
       </w:pPr>
-      <w:bookmarkStart w:id="15" w:name="_Toc242996039"/>
+      <w:bookmarkStart w:id="15" w:name="_Toc243000790"/>
       <w:r>
         <w:t>9. Графики в приложении</w:t>
       </w:r>
@@ -7988,7 +8012,7 @@
           <w:noProof/>
         </w:rPr>
         <w:drawing>
-          <wp:inline distT="0" distB="0" distL="0" distR="0" wp14:anchorId="4678AE91" wp14:editId="1ECDC426">
+          <wp:inline distT="0" distB="0" distL="0" distR="0" wp14:anchorId="46329F36" wp14:editId="1F12A745">
             <wp:extent cx="5334000" cy="2952750"/>
             <wp:effectExtent l="0" t="0" r="0" b="0"/>
             <wp:docPr id="7" name="Страница «Графики»" descr="Страница «Графики»" title="Страница «Графики»"/>
@@ -8128,7 +8152,7 @@
         <w:pStyle w:val="Heading1"/>
         <w:spacing w:before="480" w:after="200"/>
       </w:pPr>
-      <w:bookmarkStart w:id="16" w:name="_Toc242996040"/>
+      <w:bookmarkStart w:id="16" w:name="_Toc243000791"/>
       <w:r>
         <w:t>10. Графики в Grafana</w:t>
       </w:r>
@@ -8183,7 +8207,7 @@
           <w:noProof/>
         </w:rPr>
         <w:drawing>
-          <wp:inline distT="0" distB="0" distL="0" distR="0" wp14:anchorId="56EAA69E" wp14:editId="0306D9D0">
+          <wp:inline distT="0" distB="0" distL="0" distR="0" wp14:anchorId="29A7D4F0" wp14:editId="26A0D0FB">
             <wp:extent cx="5334000" cy="2952750"/>
             <wp:effectExtent l="0" t="0" r="0" b="0"/>
             <wp:docPr id="8" name="Дашборд «Теги историка» в Grafana" descr="Дашборд «Теги историка» в Grafana" title="Дашборд «Теги историка» в Grafana"/>
@@ -8610,7 +8634,7 @@
           <w:noProof/>
         </w:rPr>
         <w:drawing>
-          <wp:inline distT="0" distB="0" distL="0" distR="0" wp14:anchorId="38DEAEF2" wp14:editId="51EA3E1A">
+          <wp:inline distT="0" distB="0" distL="0" distR="0" wp14:anchorId="027E0634" wp14:editId="37C0A446">
             <wp:extent cx="5334000" cy="2952750"/>
             <wp:effectExtent l="0" t="0" r="0" b="0"/>
             <wp:docPr id="9" name="Отдельный график на каждый тег" descr="Отдельный график на каждый тег" title="Отдельный график на каждый тег"/>
@@ -8676,7 +8700,7 @@
           <w:noProof/>
         </w:rPr>
         <w:drawing>
-          <wp:inline distT="0" distB="0" distL="0" distR="0" wp14:anchorId="225D412A" wp14:editId="6E99BA4D">
+          <wp:inline distT="0" distB="0" distL="0" distR="0" wp14:anchorId="746AF1C9" wp14:editId="45CAB37D">
             <wp:extent cx="5334000" cy="2952750"/>
             <wp:effectExtent l="0" t="0" r="0" b="0"/>
             <wp:docPr id="10" name="Строки из базы — для сверки с историком" descr="Строки из базы — для сверки с историком" title="Строки из базы — для сверки с историком"/>
@@ -8735,7 +8759,7 @@
       <w:pPr>
         <w:pStyle w:val="Heading2"/>
       </w:pPr>
-      <w:bookmarkStart w:id="17" w:name="_Toc242996041"/>
+      <w:bookmarkStart w:id="17" w:name="_Toc243000792"/>
       <w:r>
         <w:t>10.1 Сверка с историком</w:t>
       </w:r>
@@ -8877,7 +8901,7 @@
       <w:pPr>
         <w:pStyle w:val="Heading2"/>
       </w:pPr>
-      <w:bookmarkStart w:id="18" w:name="_Toc242996042"/>
+      <w:bookmarkStart w:id="18" w:name="_Toc243000793"/>
       <w:r>
         <w:t>10.2 Свои панели</w:t>
       </w:r>
@@ -9461,7 +9485,7 @@
         <w:pStyle w:val="Heading1"/>
         <w:spacing w:before="480" w:after="200"/>
       </w:pPr>
-      <w:bookmarkStart w:id="19" w:name="_Toc242996043"/>
+      <w:bookmarkStart w:id="19" w:name="_Toc243000794"/>
       <w:r>
         <w:t>11. Повседневное управление</w:t>
       </w:r>
@@ -10189,7 +10213,7 @@
       <w:pPr>
         <w:pStyle w:val="Heading2"/>
       </w:pPr>
-      <w:bookmarkStart w:id="20" w:name="_Toc242996044"/>
+      <w:bookmarkStart w:id="20" w:name="_Toc243000795"/>
       <w:r>
         <w:t>11.1 Доступ с других компьютеров</w:t>
       </w:r>
@@ -10284,7 +10308,7 @@
       <w:pPr>
         <w:pStyle w:val="Heading2"/>
       </w:pPr>
-      <w:bookmarkStart w:id="21" w:name="_Toc242996045"/>
+      <w:bookmarkStart w:id="21" w:name="_Toc243000796"/>
       <w:r>
         <w:t>11.2 Смена паролей</w:t>
       </w:r>
@@ -10440,7 +10464,7 @@
       <w:pPr>
         <w:pStyle w:val="Heading2"/>
       </w:pPr>
-      <w:bookmarkStart w:id="22" w:name="_Toc242996046"/>
+      <w:bookmarkStart w:id="22" w:name="_Toc243000797"/>
       <w:r>
         <w:t>11.3 Обновление приложения</w:t>
       </w:r>
@@ -10532,7 +10556,7 @@
       <w:pPr>
         <w:pStyle w:val="Heading2"/>
       </w:pPr>
-      <w:bookmarkStart w:id="23" w:name="_Toc242996047"/>
+      <w:bookmarkStart w:id="23" w:name="_Toc243000798"/>
       <w:r>
         <w:t>11.4 Резервные копии</w:t>
       </w:r>
@@ -10551,7 +10575,7 @@
         <w:pStyle w:val="Heading1"/>
         <w:spacing w:before="480" w:after="200"/>
       </w:pPr>
-      <w:bookmarkStart w:id="24" w:name="_Toc242996048"/>
+      <w:bookmarkStart w:id="24" w:name="_Toc243000799"/>
       <w:r>
         <w:t>12. Сколько места занимают данные</w:t>
       </w:r>
@@ -10578,7 +10602,7 @@
         <w:pStyle w:val="Heading1"/>
         <w:spacing w:before="480" w:after="200"/>
       </w:pPr>
-      <w:bookmarkStart w:id="25" w:name="_Toc242996049"/>
+      <w:bookmarkStart w:id="25" w:name="_Toc243000800"/>
       <w:r>
         <w:t>13. Установка без интернета</w:t>
       </w:r>
@@ -10838,7 +10862,7 @@
         <w:pStyle w:val="Heading1"/>
         <w:spacing w:before="480" w:after="200"/>
       </w:pPr>
-      <w:bookmarkStart w:id="26" w:name="_Toc242996050"/>
+      <w:bookmarkStart w:id="26" w:name="_Toc243000801"/>
       <w:r>
         <w:t>14. Неполадки</w:t>
       </w:r>
@@ -10848,7 +10872,7 @@
       <w:pPr>
         <w:pStyle w:val="Heading2"/>
       </w:pPr>
-      <w:bookmarkStart w:id="27" w:name="_Toc242996051"/>
+      <w:bookmarkStart w:id="27" w:name="_Toc243000802"/>
       <w:r>
         <w:t>14.1 Docker и запуск</w:t>
       </w:r>
@@ -11305,7 +11329,7 @@
       <w:pPr>
         <w:pStyle w:val="Heading2"/>
       </w:pPr>
-      <w:bookmarkStart w:id="28" w:name="_Toc242996052"/>
+      <w:bookmarkStart w:id="28" w:name="_Toc243000803"/>
       <w:r>
         <w:t>14.2 Подключение к историку</w:t>
       </w:r>
@@ -11897,7 +11921,7 @@
       <w:pPr>
         <w:pStyle w:val="Heading2"/>
       </w:pPr>
-      <w:bookmarkStart w:id="29" w:name="_Toc242996053"/>
+      <w:bookmarkStart w:id="29" w:name="_Toc243000804"/>
       <w:r>
         <w:t>14.3 Данные и графики</w:t>
       </w:r>
@@ -12327,7 +12351,7 @@
         <w:pStyle w:val="Heading1"/>
         <w:spacing w:before="480" w:after="200"/>
       </w:pPr>
-      <w:bookmarkStart w:id="30" w:name="_Toc242996054"/>
+      <w:bookmarkStart w:id="30" w:name="_Toc243000805"/>
       <w:r>
         <w:t>15. Частые вопросы</w:t>
       </w:r>
@@ -12511,7 +12535,7 @@
         <w:pStyle w:val="Heading1"/>
         <w:spacing w:before="480" w:after="200"/>
       </w:pPr>
-      <w:bookmarkStart w:id="31" w:name="_Toc242996055"/>
+      <w:bookmarkStart w:id="31" w:name="_Toc243000806"/>
       <w:r>
         <w:t>16. Что где лежит</w:t>
       </w:r>
@@ -13262,10 +13286,10 @@
 <file path=word/numbering.xml><?xml version="1.0" encoding="utf-8"?>
 <w:numbering xmlns:wpc="http://schemas.microsoft.com/office/word/2010/wordprocessingCanvas" xmlns:cx="http://schemas.microsoft.com/office/drawing/2014/chartex" xmlns:cx1="http://schemas.microsoft.com/office/drawing/2015/9/8/chartex" xmlns:cx2="http://schemas.microsoft.com/office/drawing/2015/10/21/chartex" xmlns:cx3="http://schemas.microsoft.com/office/drawing/2016/5/9/chartex" xmlns:cx4="http://schemas.microsoft.com/office/drawing/2016/5/10/chartex" xmlns:cx5="http://schemas.microsoft.com/office/drawing/2016/5/11/chartex" xmlns:cx6="http://schemas.microsoft.com/office/drawing/2016/5/12/chartex" xmlns:cx7="http://schemas.microsoft.com/office/drawing/2016/5/13/chartex" xmlns:cx8="http://schemas.microsoft.com/office/drawing/2016/5/14/chartex" xmlns:mc="http://schemas.openxmlformats.org/markup-compatibility/2006" xmlns:aink="http://schemas.microsoft.com/office/drawing/2016/ink" xmlns:am3d="http://schemas.microsoft.com/office/drawing/2017/model3d" xmlns:o="urn:schemas-microsoft-com:office:office" xmlns:oel="http://schemas.microsoft.com/office/2019/extlst" xmlns:r="http://schemas.openxmlformats.org/officeDocument/2006/relationships" xmlns:m="http://schemas.openxmlformats.org/officeDocument/2006/math" xmlns:v="urn:schemas-microsoft-com:vml" xmlns:wp14="http://schemas.microsoft.com/office/word/2010/wordprocessingDrawing" xmlns:wp="http://schemas.openxmlformats.org/drawingml/2006/wordprocessingDrawing" xmlns:w10="urn:schemas-microsoft-com:office:word" xmlns:w="http://schemas.openxmlformats.org/wordprocessingml/2006/main" xmlns:w14="http://schemas.microsoft.com/office/word/2010/wordml" xmlns:w15="http://schemas.microsoft.com/office/word/2012/wordml" xmlns:w16cex="http://schemas.microsoft.com/office/word/2018/wordml/cex" xmlns:w16cid="http://schemas.microsoft.com/office/word/2016/wordml/cid" xmlns:w16="http://schemas.microsoft.com/office/word/2018/wordml" xmlns:w16du="http://schemas.microsoft.com/office/word/2023/wordml/word16du" xmlns:w16sdtdh="http://schemas.microsoft.com/office/word/2020/wordml/sdtdatahash" xmlns:w16sdtfl="http://schemas.microsoft.com/office/word/2024/wordml/sdtformatlock" xmlns:w16se="http://schemas.microsoft.com/office/word/2015/wordml/symex" xmlns:wpg="http://schemas.microsoft.com/office/word/2010/wordprocessingGroup" xmlns:wpi="http://schemas.microsoft.com/office/word/2010/wordprocessingInk" xmlns:wne="http://schemas.microsoft.com/office/word/2006/wordml" xmlns:wps="http://schemas.microsoft.com/office/word/2010/wordprocessingShape" mc:Ignorable="w14 w15 w16se w16cid w16 w16cex w16sdtdh w16sdtfl w16du wp14">
   <w:abstractNum w:abstractNumId="0" w15:restartNumberingAfterBreak="0">
-    <w:nsid w:val="2C197929"/>
+    <w:nsid w:val="3DCA35C9"/>
     <w:multiLevelType w:val="hybridMultilevel"/>
-    <w:tmpl w:val="89200DD6"/>
-    <w:lvl w:ilvl="0" w:tplc="1F08B962" w:tentative="1">
+    <w:tmpl w:val="F404093E"/>
+    <w:lvl w:ilvl="0" w:tplc="041886E8" w:tentative="1">
       <w:start w:val="1"/>
       <w:numFmt w:val="bullet"/>
       <w:lvlText w:val="●"/>
@@ -13274,7 +13298,7 @@
         <w:ind w:left="720" w:hanging="360"/>
       </w:pPr>
     </w:lvl>
-    <w:lvl w:ilvl="1" w:tplc="62E44E28" w:tentative="1">
+    <w:lvl w:ilvl="1" w:tplc="0A048426" w:tentative="1">
       <w:start w:val="1"/>
       <w:numFmt w:val="bullet"/>
       <w:lvlText w:val="○"/>
@@ -13283,7 +13307,7 @@
         <w:ind w:left="1440" w:hanging="360"/>
       </w:pPr>
     </w:lvl>
-    <w:lvl w:ilvl="2" w:tplc="E44CD2CA" w:tentative="1">
+    <w:lvl w:ilvl="2" w:tplc="03E0E5C0" w:tentative="1">
       <w:start w:val="1"/>
       <w:numFmt w:val="bullet"/>
       <w:lvlText w:val="■"/>
@@ -13292,7 +13316,7 @@
         <w:ind w:left="2160" w:hanging="360"/>
       </w:pPr>
     </w:lvl>
-    <w:lvl w:ilvl="3" w:tplc="35EE53E6" w:tentative="1">
+    <w:lvl w:ilvl="3" w:tplc="83B4009A" w:tentative="1">
       <w:start w:val="1"/>
       <w:numFmt w:val="bullet"/>
       <w:lvlText w:val="●"/>
@@ -13301,7 +13325,7 @@
         <w:ind w:left="2880" w:hanging="360"/>
       </w:pPr>
     </w:lvl>
-    <w:lvl w:ilvl="4" w:tplc="3302324C" w:tentative="1">
+    <w:lvl w:ilvl="4" w:tplc="54163A8E" w:tentative="1">
       <w:start w:val="1"/>
       <w:numFmt w:val="bullet"/>
       <w:lvlText w:val="○"/>
@@ -13310,7 +13334,7 @@
         <w:ind w:left="3600" w:hanging="360"/>
       </w:pPr>
     </w:lvl>
-    <w:lvl w:ilvl="5" w:tplc="F2460014" w:tentative="1">
+    <w:lvl w:ilvl="5" w:tplc="AEA8DF3A" w:tentative="1">
       <w:start w:val="1"/>
       <w:numFmt w:val="bullet"/>
       <w:lvlText w:val="■"/>
@@ -13319,7 +13343,7 @@
         <w:ind w:left="4320" w:hanging="360"/>
       </w:pPr>
     </w:lvl>
-    <w:lvl w:ilvl="6" w:tplc="7F4E728C" w:tentative="1">
+    <w:lvl w:ilvl="6" w:tplc="7574473E" w:tentative="1">
       <w:start w:val="1"/>
       <w:numFmt w:val="bullet"/>
       <w:lvlText w:val="●"/>
@@ -13328,7 +13352,7 @@
         <w:ind w:left="5040" w:hanging="360"/>
       </w:pPr>
     </w:lvl>
-    <w:lvl w:ilvl="7" w:tplc="0890C83E" w:tentative="1">
+    <w:lvl w:ilvl="7" w:tplc="915270C0" w:tentative="1">
       <w:start w:val="1"/>
       <w:numFmt w:val="bullet"/>
       <w:lvlText w:val="●"/>
@@ -13337,7 +13361,7 @@
         <w:ind w:left="5760" w:hanging="360"/>
       </w:pPr>
     </w:lvl>
-    <w:lvl w:ilvl="8" w:tplc="7F94C822" w:tentative="1">
+    <w:lvl w:ilvl="8" w:tplc="DA6AD63A" w:tentative="1">
       <w:start w:val="1"/>
       <w:numFmt w:val="bullet"/>
       <w:lvlText w:val="●"/>
@@ -13348,183 +13372,183 @@
     </w:lvl>
   </w:abstractNum>
   <w:abstractNum w:abstractNumId="1" w15:restartNumberingAfterBreak="0">
-    <w:nsid w:val="3F3938DF"/>
+    <w:nsid w:val="3F990C11"/>
     <w:multiLevelType w:val="hybridMultilevel"/>
-    <w:tmpl w:val="2A463C8A"/>
-    <w:lvl w:ilvl="0" w:tplc="0CDE0372">
+    <w:tmpl w:val="142647F4"/>
+    <w:lvl w:ilvl="0" w:tplc="D9A0725C">
       <w:start w:val="1"/>
-      <w:numFmt w:val="bullet"/>
-      <w:lvlText w:val="•"/>
+      <w:numFmt w:val="decimal"/>
+      <w:lvlText w:val="%1."/>
       <w:lvlJc w:val="left"/>
       <w:pPr>
-        <w:ind w:left="567" w:hanging="283"/>
+        <w:ind w:left="567" w:hanging="340"/>
       </w:pPr>
     </w:lvl>
-    <w:lvl w:ilvl="1" w:tplc="743A64F0" w:tentative="1">
+    <w:lvl w:ilvl="1" w:tplc="9B605FE2" w:tentative="1">
       <w:start w:val="1"/>
-      <w:numFmt w:val="bullet"/>
-      <w:lvlText w:val="–"/>
+      <w:numFmt w:val="lowerLetter"/>
+      <w:lvlText w:val="%2)"/>
       <w:lvlJc w:val="left"/>
       <w:pPr>
-        <w:ind w:left="1134" w:hanging="283"/>
+        <w:ind w:left="1134" w:hanging="340"/>
       </w:pPr>
     </w:lvl>
-    <w:lvl w:ilvl="2" w:tplc="E21CCC2E">
+    <w:lvl w:ilvl="2" w:tplc="FDF2CA9C">
       <w:numFmt w:val="decimal"/>
       <w:lvlText w:val=""/>
       <w:lvlJc w:val="left"/>
     </w:lvl>
-    <w:lvl w:ilvl="3" w:tplc="AEE4E358">
+    <w:lvl w:ilvl="3" w:tplc="69649178">
       <w:numFmt w:val="decimal"/>
       <w:lvlText w:val=""/>
       <w:lvlJc w:val="left"/>
     </w:lvl>
-    <w:lvl w:ilvl="4" w:tplc="6AACAC04">
+    <w:lvl w:ilvl="4" w:tplc="0B8E946E">
       <w:numFmt w:val="decimal"/>
       <w:lvlText w:val=""/>
       <w:lvlJc w:val="left"/>
     </w:lvl>
-    <w:lvl w:ilvl="5" w:tplc="A5C6067A">
+    <w:lvl w:ilvl="5" w:tplc="A8F8B832">
       <w:numFmt w:val="decimal"/>
       <w:lvlText w:val=""/>
       <w:lvlJc w:val="left"/>
     </w:lvl>
-    <w:lvl w:ilvl="6" w:tplc="AF3AE34E">
+    <w:lvl w:ilvl="6" w:tplc="EA7294A4">
       <w:numFmt w:val="decimal"/>
       <w:lvlText w:val=""/>
       <w:lvlJc w:val="left"/>
     </w:lvl>
-    <w:lvl w:ilvl="7" w:tplc="E2F43F1E">
+    <w:lvl w:ilvl="7" w:tplc="D1E6E6BE">
       <w:numFmt w:val="decimal"/>
       <w:lvlText w:val=""/>
       <w:lvlJc w:val="left"/>
     </w:lvl>
-    <w:lvl w:ilvl="8" w:tplc="D00278D6">
+    <w:lvl w:ilvl="8" w:tplc="8A9C2DDE">
       <w:numFmt w:val="decimal"/>
       <w:lvlText w:val=""/>
       <w:lvlJc w:val="left"/>
     </w:lvl>
   </w:abstractNum>
   <w:abstractNum w:abstractNumId="2" w15:restartNumberingAfterBreak="0">
-    <w:nsid w:val="6EF03821"/>
+    <w:nsid w:val="71D83C54"/>
     <w:multiLevelType w:val="hybridMultilevel"/>
-    <w:tmpl w:val="04F8DAC6"/>
-    <w:lvl w:ilvl="0" w:tplc="5A0251A4">
+    <w:tmpl w:val="4ED2490E"/>
+    <w:lvl w:ilvl="0" w:tplc="F730B66A">
       <w:start w:val="1"/>
-      <w:numFmt w:val="decimal"/>
-      <w:lvlText w:val="%1."/>
+      <w:numFmt w:val="bullet"/>
+      <w:lvlText w:val="•"/>
       <w:lvlJc w:val="left"/>
       <w:pPr>
-        <w:ind w:left="567" w:hanging="340"/>
+        <w:ind w:left="567" w:hanging="283"/>
       </w:pPr>
     </w:lvl>
-    <w:lvl w:ilvl="1" w:tplc="8856E576" w:tentative="1">
+    <w:lvl w:ilvl="1" w:tplc="76122082" w:tentative="1">
       <w:start w:val="1"/>
-      <w:numFmt w:val="lowerLetter"/>
-      <w:lvlText w:val="%2)"/>
+      <w:numFmt w:val="bullet"/>
+      <w:lvlText w:val="–"/>
       <w:lvlJc w:val="left"/>
       <w:pPr>
-        <w:ind w:left="1134" w:hanging="340"/>
+        <w:ind w:left="1134" w:hanging="283"/>
       </w:pPr>
     </w:lvl>
-    <w:lvl w:ilvl="2" w:tplc="A662A58E">
+    <w:lvl w:ilvl="2" w:tplc="9118D648">
       <w:numFmt w:val="decimal"/>
       <w:lvlText w:val=""/>
       <w:lvlJc w:val="left"/>
     </w:lvl>
-    <w:lvl w:ilvl="3" w:tplc="DA5485C2">
+    <w:lvl w:ilvl="3" w:tplc="1E761984">
       <w:numFmt w:val="decimal"/>
       <w:lvlText w:val=""/>
       <w:lvlJc w:val="left"/>
     </w:lvl>
-    <w:lvl w:ilvl="4" w:tplc="E140D5D2">
+    <w:lvl w:ilvl="4" w:tplc="5B265D40">
       <w:numFmt w:val="decimal"/>
       <w:lvlText w:val=""/>
       <w:lvlJc w:val="left"/>
     </w:lvl>
-    <w:lvl w:ilvl="5" w:tplc="79923150">
+    <w:lvl w:ilvl="5" w:tplc="DF488468">
       <w:numFmt w:val="decimal"/>
       <w:lvlText w:val=""/>
       <w:lvlJc w:val="left"/>
     </w:lvl>
-    <w:lvl w:ilvl="6" w:tplc="153AC9A0">
+    <w:lvl w:ilvl="6" w:tplc="2C88CC4E">
       <w:numFmt w:val="decimal"/>
       <w:lvlText w:val=""/>
       <w:lvlJc w:val="left"/>
     </w:lvl>
-    <w:lvl w:ilvl="7" w:tplc="A6EA01C8">
+    <w:lvl w:ilvl="7" w:tplc="6F3CEAF6">
       <w:numFmt w:val="decimal"/>
       <w:lvlText w:val=""/>
       <w:lvlJc w:val="left"/>
     </w:lvl>
-    <w:lvl w:ilvl="8" w:tplc="CDAE11B6">
+    <w:lvl w:ilvl="8" w:tplc="80F46EC8">
       <w:numFmt w:val="decimal"/>
       <w:lvlText w:val=""/>
       <w:lvlJc w:val="left"/>
     </w:lvl>
   </w:abstractNum>
-  <w:num w:numId="1" w16cid:durableId="1064523273">
+  <w:num w:numId="1" w16cid:durableId="2141997408">
     <w:abstractNumId w:val="0"/>
     <w:lvlOverride w:ilvl="0">
       <w:startOverride w:val="1"/>
     </w:lvlOverride>
   </w:num>
-  <w:num w:numId="2" w16cid:durableId="2023626953">
+  <w:num w:numId="2" w16cid:durableId="1351445691">
+    <w:abstractNumId w:val="2"/>
+    <w:lvlOverride w:ilvl="0">
+      <w:startOverride w:val="1"/>
+    </w:lvlOverride>
+  </w:num>
+  <w:num w:numId="3" w16cid:durableId="229003703">
     <w:abstractNumId w:val="1"/>
     <w:lvlOverride w:ilvl="0">
       <w:startOverride w:val="1"/>
     </w:lvlOverride>
   </w:num>
-  <w:num w:numId="3" w16cid:durableId="447237219">
+  <w:num w:numId="4" w16cid:durableId="1914777050">
     <w:abstractNumId w:val="2"/>
     <w:lvlOverride w:ilvl="0">
       <w:startOverride w:val="1"/>
     </w:lvlOverride>
   </w:num>
-  <w:num w:numId="4" w16cid:durableId="536936510">
+  <w:num w:numId="5" w16cid:durableId="291331316">
+    <w:abstractNumId w:val="2"/>
+    <w:lvlOverride w:ilvl="0">
+      <w:startOverride w:val="1"/>
+    </w:lvlOverride>
+  </w:num>
+  <w:num w:numId="6" w16cid:durableId="577133478">
     <w:abstractNumId w:val="1"/>
     <w:lvlOverride w:ilvl="0">
       <w:startOverride w:val="1"/>
     </w:lvlOverride>
   </w:num>
-  <w:num w:numId="5" w16cid:durableId="956180104">
+  <w:num w:numId="7" w16cid:durableId="1222205487">
+    <w:abstractNumId w:val="2"/>
+    <w:lvlOverride w:ilvl="0">
+      <w:startOverride w:val="1"/>
+    </w:lvlOverride>
+  </w:num>
+  <w:num w:numId="8" w16cid:durableId="1556577835">
     <w:abstractNumId w:val="1"/>
     <w:lvlOverride w:ilvl="0">
       <w:startOverride w:val="1"/>
     </w:lvlOverride>
   </w:num>
-  <w:num w:numId="6" w16cid:durableId="109324421">
+  <w:num w:numId="9" w16cid:durableId="1555461254">
+    <w:abstractNumId w:val="1"/>
+    <w:lvlOverride w:ilvl="0">
+      <w:startOverride w:val="1"/>
+    </w:lvlOverride>
+  </w:num>
+  <w:num w:numId="10" w16cid:durableId="2068062967">
     <w:abstractNumId w:val="2"/>
     <w:lvlOverride w:ilvl="0">
       <w:startOverride w:val="1"/>
     </w:lvlOverride>
   </w:num>
-  <w:num w:numId="7" w16cid:durableId="949092367">
-    <w:abstractNumId w:val="1"/>
-    <w:lvlOverride w:ilvl="0">
-      <w:startOverride w:val="1"/>
-    </w:lvlOverride>
-  </w:num>
-  <w:num w:numId="8" w16cid:durableId="140123837">
+  <w:num w:numId="11" w16cid:durableId="1315142966">
     <w:abstractNumId w:val="2"/>
-    <w:lvlOverride w:ilvl="0">
-      <w:startOverride w:val="1"/>
-    </w:lvlOverride>
-  </w:num>
-  <w:num w:numId="9" w16cid:durableId="860582079">
-    <w:abstractNumId w:val="2"/>
-    <w:lvlOverride w:ilvl="0">
-      <w:startOverride w:val="1"/>
-    </w:lvlOverride>
-  </w:num>
-  <w:num w:numId="10" w16cid:durableId="948194871">
-    <w:abstractNumId w:val="1"/>
-    <w:lvlOverride w:ilvl="0">
-      <w:startOverride w:val="1"/>
-    </w:lvlOverride>
-  </w:num>
-  <w:num w:numId="11" w16cid:durableId="1192961577">
-    <w:abstractNumId w:val="1"/>
     <w:lvlOverride w:ilvl="0">
       <w:startOverride w:val="1"/>
     </w:lvlOverride>
@@ -14176,7 +14200,7 @@
     <w:autoRedefine/>
     <w:uiPriority w:val="39"/>
     <w:unhideWhenUsed/>
-    <w:rsid w:val="003941CB"/>
+    <w:rsid w:val="00925B26"/>
     <w:pPr>
       <w:spacing w:after="100"/>
     </w:pPr>
@@ -14188,7 +14212,7 @@
     <w:autoRedefine/>
     <w:uiPriority w:val="39"/>
     <w:unhideWhenUsed/>
-    <w:rsid w:val="003941CB"/>
+    <w:rsid w:val="00925B26"/>
     <w:pPr>
       <w:spacing w:after="100"/>
       <w:ind w:left="220"/>

</xml_diff>